<commit_message>
2.1: 2026-yil ma'lumotlari 2021–2025-yillar bilan almashtirildi (matn, 2.1.3-rasm); 4.1.1-rasmga chegaralar qo'shildi
Co-Authored-By: Claude Opus 5.5 <noreply@anthropic.com>
Claude-Session: https://claude.ai/code/session_01PxHTC8Q7yHdrpAeUA5KUgM
</commit_message>
<xml_diff>
--- a/paragraflar/2.1-paragraf.docx
+++ b/paragraflar/2.1-paragraf.docx
@@ -3336,7 +3336,7 @@
           <w:rFonts w:ascii="Times New Roman" w:hAnsi="Times New Roman" w:cs="Times New Roman" w:eastAsia="Times New Roman"/>
           <w:sz w:val="28"/>
         </w:rPr>
-        <w:t xml:space="preserve">Amaldagi baholash tizimi natijalariga ko‘ra, O‘zbekiston bank tizimi kapital yetarliligi bo‘yicha barqaror holatda. Kapital monandligi 2023-yil oxirida 17,5 foizni</w:t>
+        <w:t xml:space="preserve">Amaldagi baholash tizimi natijalariga ko‘ra, O‘zbekiston bank tizimi kapital yetarliligi bo‘yicha barqaror holatda. Kapital monandligi 2021–2025-yillarda 17,4–18,3 foiz oralig‘ida bo‘lib, 2023-yil oxirida 17,5 foizni</w:t>
       </w:r>
       <w:r>
         <w:rPr>
@@ -3349,7 +3349,7 @@
           <w:rFonts w:ascii="Times New Roman" w:hAnsi="Times New Roman" w:cs="Times New Roman" w:eastAsia="Times New Roman"/>
           <w:sz w:val="28"/>
         </w:rPr>
-        <w:t xml:space="preserve">, 2024-yil oxirida 17 foizni, 2025-yil oxirida 18,3 foizni tashkil etgan; asosiy kapital (CET1) monandligi 2025-yil oxirida 14,7 foizga teng bo‘lgan</w:t>
+        <w:t xml:space="preserve">, 2025-yil oxirida 18,3 foizni tashkil etgan; asosiy kapital (CET1) monandligi 2025-yil oxirida 14,7 foizga teng bo‘lgan</w:t>
       </w:r>
       <w:r>
         <w:rPr>
@@ -3362,7 +3362,7 @@
           <w:rFonts w:ascii="Times New Roman" w:hAnsi="Times New Roman" w:cs="Times New Roman" w:eastAsia="Times New Roman"/>
           <w:sz w:val="28"/>
         </w:rPr>
-        <w:t xml:space="preserve">. 2026-yil 1-iyul holatiga kapital monandligi 18,5 foizni, CET1 15 foizni, muammoli kreditlar ulushi 3,6 foizni tashkil etgan</w:t>
+        <w:t xml:space="preserve">. Muammoli kreditlar ulushi esa 2021-yil oxiridagi 5,2 foizdan 2025-yil oxirida 3,0 foizgacha kamaygan</w:t>
       </w:r>
       <w:r>
         <w:rPr>
@@ -6547,7 +6547,7 @@
         <w:t xml:space="preserve"> </w:t>
       </w:r>
       <w:r>
-        <w:t xml:space="preserve">Countercyclical capital buffer // The Central Bank of the Republic of Uzbekistan.</w:t>
+        <w:t xml:space="preserve">O‘zbekiston Respublikasi Markaziy banki. Statistik byulleten: 2021-yil. – Toshkent, 2022. – 5.1.8b-jadval; O‘zbekiston Respublikasi Markaziy banki. Statistik byulleten: 2026-yil mart. – Toshkent, 2026. – 5.1.2, 5.1.3, 5.1.4, 5.1.6, 5.1.7, 5.1.8-jadvallar. – https://cbu.uz/uz/statistics/buleten/; The Central Bank of the Republic of Uzbekistan. Financial Stability Report for 2025. – Tashkent, 2026.</w:t>
       </w:r>
     </w:p>
   </w:footnote>
@@ -6566,7 +6566,7 @@
         <w:t xml:space="preserve"> </w:t>
       </w:r>
       <w:r>
-        <w:t xml:space="preserve">Muallif tomonidan quyidagi manbalar asosida tuzilgan: IMF Country Report No. 25/227, 2025; The Central Bank of Uzbekistan. Financial Stability Report for 2024; Financial Stability Report for H1 2025; Financial Stability Report for 2025; Countercyclical capital buffer // cbu.uz.</w:t>
+        <w:t xml:space="preserve">Muallif tomonidan quyidagi manbalar asosida tuzilgan: O‘zbekiston Respublikasi Markaziy banki. Statistik byulleten: 2021-yil. – Toshkent, 2022; O‘zbekiston Respublikasi Markaziy banki. Statistik byulleten: 2026-yil mart. – Toshkent, 2026. – https://cbu.uz/uz/statistics/buleten/; IMF Country Report No. 25/227, 2025; The Central Bank of Uzbekistan. Financial Stability Report for 2024; The Central Bank of Uzbekistan. Financial Stability Report for 2025.</w:t>
       </w:r>
     </w:p>
   </w:footnote>
@@ -7936,19 +7936,19 @@
               <c:strCache>
                 <c:ptCount val="5"/>
                 <c:pt idx="0">
-                  <c:v>2023-y. oxiri</c:v>
+                  <c:v>2021</c:v>
                 </c:pt>
                 <c:pt idx="1">
-                  <c:v>2024-y. oxiri</c:v>
+                  <c:v>2022</c:v>
                 </c:pt>
                 <c:pt idx="2">
-                  <c:v>2025-y. I yarim</c:v>
+                  <c:v>2023</c:v>
                 </c:pt>
                 <c:pt idx="3">
-                  <c:v>2025-y. oxiri</c:v>
+                  <c:v>2024</c:v>
                 </c:pt>
                 <c:pt idx="4">
-                  <c:v>2026-y. 1-iyul</c:v>
+                  <c:v>2025</c:v>
                 </c:pt>
               </c:strCache>
             </c:strRef>
@@ -7963,16 +7963,16 @@
                   <c:v>17.5</c:v>
                 </c:pt>
                 <c:pt idx="1">
-                  <c:v>17.0</c:v>
+                  <c:v>17.8</c:v>
                 </c:pt>
                 <c:pt idx="2">
+                  <c:v>17.5</c:v>
+                </c:pt>
+                <c:pt idx="3">
                   <c:v>17.4</c:v>
                 </c:pt>
-                <c:pt idx="3">
+                <c:pt idx="4">
                   <c:v>18.3</c:v>
-                </c:pt>
-                <c:pt idx="4">
-                  <c:v>18.5</c:v>
                 </c:pt>
               </c:numCache>
             </c:numRef>
@@ -8041,19 +8041,19 @@
               <c:strCache>
                 <c:ptCount val="5"/>
                 <c:pt idx="0">
-                  <c:v>2023-y. oxiri</c:v>
+                  <c:v>2021</c:v>
                 </c:pt>
                 <c:pt idx="1">
-                  <c:v>2024-y. oxiri</c:v>
+                  <c:v>2022</c:v>
                 </c:pt>
                 <c:pt idx="2">
-                  <c:v>2025-y. I yarim</c:v>
+                  <c:v>2023</c:v>
                 </c:pt>
                 <c:pt idx="3">
-                  <c:v>2025-y. oxiri</c:v>
+                  <c:v>2024</c:v>
                 </c:pt>
                 <c:pt idx="4">
-                  <c:v>2026-y. 1-iyul</c:v>
+                  <c:v>2025</c:v>
                 </c:pt>
               </c:strCache>
             </c:strRef>
@@ -8064,14 +8064,20 @@
               <c:numCache>
                 <c:formatCode>General</c:formatCode>
                 <c:ptCount val="5"/>
-                <c:pt idx="2">
+                <c:pt idx="0">
                   <c:v>14.6</c:v>
                 </c:pt>
+                <c:pt idx="1">
+                  <c:v>14.4</c:v>
+                </c:pt>
+                <c:pt idx="2">
+                  <c:v>14.1</c:v>
+                </c:pt>
                 <c:pt idx="3">
-                  <c:v>14.7</c:v>
+                  <c:v>14.3</c:v>
                 </c:pt>
                 <c:pt idx="4">
-                  <c:v>15.0</c:v>
+                  <c:v>14.7</c:v>
                 </c:pt>
               </c:numCache>
             </c:numRef>

</xml_diff>